<commit_message>
Ensured consistency in UI popups.
</commit_message>
<xml_diff>
--- a/project/documents/formaldocuments/aiaShortDeclaration_esign.docx
+++ b/project/documents/formaldocuments/aiaShortDeclaration_esign.docx
@@ -14,8 +14,8 @@
       </w:pPr>
       <w:r>
         <w:pict w14:anchorId="1DF63F24">
-          <v:group id="_x0000_s1028" style="position:absolute;margin-left:51.15pt;margin-top:2.3pt;width:520.2pt;height:42pt;z-index:-251658240;mso-position-horizontal-relative:page" coordorigin="960,386" coordsize="10404,840">
-            <v:shape id="_x0000_s1029" style="position:absolute;left:960;top:386;width:10404;height:840" coordorigin="960,386" coordsize="10404,840" path="m960,746r,120l962,895r17,85l1014,1056r52,65l1131,1172r76,36l1291,1225r29,1l11005,1226r86,-11l11170,1186r69,-47l11295,1079r41,-73l11360,924r5,-58l11365,746r-11,-87l11324,580r-46,-69l11217,455r-72,-41l11063,390r-58,-4l1320,386r-86,10l1155,426r-69,46l1030,533r-41,73l965,687r-5,59xe" filled="f" strokecolor="#010202" strokeweight=".48261mm">
+          <v:group id="_x0000_s2052" style="position:absolute;margin-left:51.15pt;margin-top:2.3pt;width:520.2pt;height:42pt;z-index:-251658240;mso-position-horizontal-relative:page" coordorigin="960,386" coordsize="10404,840">
+            <v:shape id="_x0000_s2053" style="position:absolute;left:960;top:386;width:10404;height:840" coordorigin="960,386" coordsize="10404,840" path="m960,746r,120l962,895r17,85l1014,1056r52,65l1131,1172r76,36l1291,1225r29,1l11005,1226r86,-11l11170,1186r69,-47l11295,1079r41,-73l11360,924r5,-58l11365,746r-11,-87l11324,580r-46,-69l11217,455r-72,-41l11063,390r-58,-4l1320,386r-86,10l1155,426r-69,46l1030,533r-41,73l965,687r-5,59xe" filled="f" strokecolor="#010202" strokeweight=".48261mm">
               <v:path arrowok="t"/>
             </v:shape>
             <w10:wrap anchorx="page"/>
@@ -522,7 +522,6 @@
                   <w14:uncheckedState w14:val="2610" w14:font="MS Gothic"/>
                 </w14:checkbox>
               </w:sdtPr>
-              <w:sdtEndPr/>
               <w:sdtContent>
                 <w:r>
                   <w:rPr>
@@ -628,7 +627,6 @@
                   <w14:uncheckedState w14:val="2610" w14:font="MS Gothic"/>
                 </w14:checkbox>
               </w:sdtPr>
-              <w:sdtEndPr/>
               <w:sdtContent>
                 <w:r>
                   <w:rPr>
@@ -756,8 +754,9 @@
                 <w:szCs w:val="20"/>
                 <w:u w:val="single"/>
               </w:rPr>
-              <w:t>&lt;&lt;filedDate&gt;&gt;</w:t>
-            </w:r>
+              <w:t>&lt;&lt;filedDate&gt;</w:t>
+            </w:r>
+            <w:proofErr w:type="gramStart"/>
             <w:r>
               <w:rPr>
                 <w:rFonts w:cstheme="minorHAnsi"/>
@@ -766,6 +765,16 @@
                 <w:szCs w:val="20"/>
                 <w:u w:val="single"/>
               </w:rPr>
+              <w:t>&gt;</w:t>
+            </w:r>
+            <w:r>
+              <w:rPr>
+                <w:rFonts w:cstheme="minorHAnsi"/>
+                <w:color w:val="010202"/>
+                <w:sz w:val="20"/>
+                <w:szCs w:val="20"/>
+                <w:u w:val="single"/>
+              </w:rPr>
               <w:t xml:space="preserve"> </w:t>
             </w:r>
             <w:r>
@@ -775,7 +784,17 @@
                 <w:sz w:val="20"/>
                 <w:szCs w:val="20"/>
               </w:rPr>
-              <w:t xml:space="preserve">. </w:t>
+              <w:t>.</w:t>
+            </w:r>
+            <w:proofErr w:type="gramEnd"/>
+            <w:r>
+              <w:rPr>
+                <w:rFonts w:cstheme="minorHAnsi"/>
+                <w:color w:val="010202"/>
+                <w:sz w:val="20"/>
+                <w:szCs w:val="20"/>
+              </w:rPr>
+              <w:t xml:space="preserve"> </w:t>
             </w:r>
           </w:p>
           <w:p>
@@ -1627,8 +1646,19 @@
                 <w:sz w:val="20"/>
                 <w:szCs w:val="20"/>
               </w:rPr>
-              <w:t xml:space="preserve">   Date (Optional) :</w:t>
-            </w:r>
+              <w:t xml:space="preserve">   Date (Optional</w:t>
+            </w:r>
+            <w:proofErr w:type="gramStart"/>
+            <w:r>
+              <w:rPr>
+                <w:rFonts w:eastAsia="Arial" w:cstheme="minorHAnsi"/>
+                <w:color w:val="010202"/>
+                <w:sz w:val="20"/>
+                <w:szCs w:val="20"/>
+              </w:rPr>
+              <w:t>) :</w:t>
+            </w:r>
+            <w:proofErr w:type="gramEnd"/>
             <w:r>
               <w:rPr>
                 <w:rFonts w:eastAsia="Arial" w:cstheme="minorHAnsi"/>

</xml_diff>